<commit_message>
SETP: v1.1 — Valor en blanco para definición por Dura
</commit_message>
<xml_diff>
--- a/PROYECTO-003-SETP-SINCELEJO/PROPUESTA-INTEGRAL-SETP-SINCELEJO.docx
+++ b/PROYECTO-003-SETP-SINCELEJO/PROPUESTA-INTEGRAL-SETP-SINCELEJO.docx
@@ -3158,7 +3158,7 @@
                 <w:bCs/>
                 <w:b/>
               </w:rPr>
-              <w:t xml:space="preserve">$39.000.000</w:t>
+              <w:t xml:space="preserve">A definir</w:t>
             </w:r>
           </w:p>
         </w:tc>
@@ -3192,7 +3192,7 @@
                 <w:bCs/>
                 <w:b/>
               </w:rPr>
-              <w:t xml:space="preserve">$39.000.000</w:t>
+              <w:t xml:space="preserve">A definir</w:t>
             </w:r>
           </w:p>
         </w:tc>
@@ -3333,7 +3333,7 @@
               <w:jc w:val="left"/>
             </w:pPr>
             <w:r>
-              <w:t xml:space="preserve">$15.600.000</w:t>
+              <w:t xml:space="preserve">A definir</w:t>
             </w:r>
           </w:p>
         </w:tc>
@@ -3383,7 +3383,7 @@
               <w:jc w:val="left"/>
             </w:pPr>
             <w:r>
-              <w:t xml:space="preserve">$11.700.000</w:t>
+              <w:t xml:space="preserve">A definir</w:t>
             </w:r>
           </w:p>
         </w:tc>
@@ -3433,7 +3433,7 @@
               <w:jc w:val="left"/>
             </w:pPr>
             <w:r>
-              <w:t xml:space="preserve">$11.700.000</w:t>
+              <w:t xml:space="preserve">A definir</w:t>
             </w:r>
           </w:p>
         </w:tc>
@@ -3495,7 +3495,7 @@
                 <w:bCs/>
                 <w:b/>
               </w:rPr>
-              <w:t xml:space="preserve">$39.000.000</w:t>
+              <w:t xml:space="preserve">A definir</w:t>
             </w:r>
           </w:p>
         </w:tc>

</xml_diff>

<commit_message>
SETP: v1.2 — Todo a nombre de Dura, interno organizado aparte
</commit_message>
<xml_diff>
--- a/PROYECTO-003-SETP-SINCELEJO/PROPUESTA-INTEGRAL-SETP-SINCELEJO.docx
+++ b/PROYECTO-003-SETP-SINCELEJO/PROPUESTA-INTEGRAL-SETP-SINCELEJO.docx
@@ -2,13 +2,13 @@
 <file path=word/document.xml><?xml version="1.0" encoding="utf-8"?>
 <w:document xmlns:w="http://schemas.openxmlformats.org/wordprocessingml/2006/main" xmlns:m="http://schemas.openxmlformats.org/officeDocument/2006/math" xmlns:r="http://schemas.openxmlformats.org/officeDocument/2006/relationships" xmlns:o="urn:schemas-microsoft-com:office:office" xmlns:v="urn:schemas-microsoft-com:vml" xmlns:w10="urn:schemas-microsoft-com:office:word" xmlns:a="http://schemas.openxmlformats.org/drawingml/2006/main" xmlns:pic="http://schemas.openxmlformats.org/drawingml/2006/picture" xmlns:wp="http://schemas.openxmlformats.org/drawingml/2006/wordprocessingDrawing">
   <w:body>
-    <w:bookmarkStart w:id="21" w:name="propuesta-técnica-y-económica-integral"/>
+    <w:bookmarkStart w:id="21" w:name="propuesta-técnica-y-económica"/>
     <w:p>
       <w:pPr>
         <w:pStyle w:val="Heading1"/>
       </w:pPr>
       <w:r>
-        <w:t xml:space="preserve">PROPUESTA TÉCNICA Y ECONÓMICA INTEGRAL</w:t>
+        <w:t xml:space="preserve">PROPUESTA TÉCNICA Y ECONÓMICA</w:t>
       </w:r>
     </w:p>
     <w:bookmarkStart w:id="20" w:name="X1b49ff7f931a17c35770069e57ad25b3ab70809"/>
@@ -24,6 +24,22 @@
       <w:pPr>
         <w:pStyle w:val="FirstParagraph"/>
       </w:pPr>
+      <w:r>
+        <w:rPr>
+          <w:bCs/>
+          <w:b/>
+        </w:rPr>
+        <w:t xml:space="preserve">Proponente:</w:t>
+      </w:r>
+      <w:r>
+        <w:t xml:space="preserve"> </w:t>
+      </w:r>
+      <w:r>
+        <w:t xml:space="preserve">D &amp; A Asociados S.A.S.</w:t>
+      </w:r>
+      <w:r>
+        <w:br/>
+      </w:r>
       <w:r>
         <w:rPr>
           <w:bCs/>
@@ -63,22 +79,13 @@
     </w:p>
     <w:bookmarkEnd w:id="20"/>
     <w:bookmarkEnd w:id="21"/>
-    <w:bookmarkStart w:id="24" w:name="presentación-de-los-proponentes"/>
+    <w:bookmarkStart w:id="22" w:name="presentación-del-proponente"/>
     <w:p>
       <w:pPr>
         <w:pStyle w:val="Heading1"/>
       </w:pPr>
       <w:r>
-        <w:t xml:space="preserve">1. PRESENTACIÓN DE LOS PROPONENTES</w:t>
-      </w:r>
-    </w:p>
-    <w:bookmarkStart w:id="22" w:name="X4748bb52bff2f91c31ec3d2fdee8b50546eeb96"/>
-    <w:p>
-      <w:pPr>
-        <w:pStyle w:val="Heading2"/>
-      </w:pPr>
-      <w:r>
-        <w:t xml:space="preserve">1.1 D &amp; A Asociados S.A.S. — Contratista Principal</w:t>
+        <w:t xml:space="preserve">1. PRESENTACIÓN DEL PROPONENTE</w:t>
       </w:r>
     </w:p>
     <w:p>
@@ -86,25 +93,25 @@
         <w:pStyle w:val="FirstParagraph"/>
       </w:pPr>
       <w:r>
-        <w:t xml:space="preserve">Empresa especializada en estructuración jurídica, financiera y contractual de proyectos de infraestructura, transporte y contratación pública. Cuenta con oficinas en Bogotá D.C. (Calle 93 No 11a-28, Edificio Capital Park 93) y asociaciones estratégicas con firmas de abogados en Colombia.</w:t>
-      </w:r>
-    </w:p>
-    <w:bookmarkEnd w:id="22"/>
-    <w:bookmarkStart w:id="23" w:name="X9f3bed8afe9f0ffd4e0c6ecfd18dc7c1172c020"/>
-    <w:p>
-      <w:pPr>
-        <w:pStyle w:val="Heading2"/>
-      </w:pPr>
-      <w:r>
-        <w:t xml:space="preserve">1.2 InnovaDataCO S.A.S. — Subcontratista Tecnológico</w:t>
-      </w:r>
-    </w:p>
-    <w:p>
-      <w:pPr>
-        <w:pStyle w:val="FirstParagraph"/>
-      </w:pPr>
-      <w:r>
-        <w:t xml:space="preserve">Empresa privada especializada en la estructuración, diseño, desarrollo e implementación de soluciones tecnológicas aplicadas a los sectores público y privado. Integra tecnología, optimización de procesos, analítica avanzada y visión estratégica para transformar la información en valor, fortalecer la toma de decisiones, optimizar procesos críticos y generar resultados medibles y sostenibles.</w:t>
+        <w:rPr>
+          <w:bCs/>
+          <w:b/>
+        </w:rPr>
+        <w:t xml:space="preserve">D &amp; A Asociados S.A.S.</w:t>
+      </w:r>
+      <w:r>
+        <w:t xml:space="preserve"> </w:t>
+      </w:r>
+      <w:r>
+        <w:t xml:space="preserve">es una empresa especializada en estructuración jurídica, financiera y contractual de proyectos de infraestructura, transporte y contratación pública. Cuenta con oficinas en Bogotá D.C. (Calle 93 No 11a-28, Edificio Capital Park 93, Oficina 603) y asociaciones estratégicas con firmas de abogados en Colombia.</w:t>
+      </w:r>
+    </w:p>
+    <w:p>
+      <w:pPr>
+        <w:pStyle w:val="BodyText"/>
+      </w:pPr>
+      <w:r>
+        <w:t xml:space="preserve">La firma dispone de un equipo multidisciplinario que integra capacidades jurídicas, financieras, técnicas operativas y tecnológicas, lo que permite ofrecer acompañamiento integral en la estructuración de proyectos complejos de movilidad y transporte público.</w:t>
       </w:r>
     </w:p>
     <w:p>
@@ -114,9 +121,8 @@
         </w:pict>
       </w:r>
     </w:p>
-    <w:bookmarkEnd w:id="23"/>
-    <w:bookmarkEnd w:id="24"/>
-    <w:bookmarkStart w:id="25" w:name="contexto-del-proyecto"/>
+    <w:bookmarkEnd w:id="22"/>
+    <w:bookmarkStart w:id="23" w:name="contexto-del-proyecto"/>
     <w:p>
       <w:pPr>
         <w:pStyle w:val="Heading1"/>
@@ -156,8 +162,8 @@
         </w:pict>
       </w:r>
     </w:p>
-    <w:bookmarkEnd w:id="25"/>
-    <w:bookmarkStart w:id="26" w:name="objeto-del-contrato"/>
+    <w:bookmarkEnd w:id="23"/>
+    <w:bookmarkStart w:id="24" w:name="objeto-del-contrato"/>
     <w:p>
       <w:pPr>
         <w:pStyle w:val="Heading1"/>
@@ -245,8 +251,8 @@
         </w:pict>
       </w:r>
     </w:p>
-    <w:bookmarkEnd w:id="26"/>
-    <w:bookmarkStart w:id="31" w:name="alcance-de-los-servicios"/>
+    <w:bookmarkEnd w:id="24"/>
+    <w:bookmarkStart w:id="29" w:name="alcance-de-los-servicios"/>
     <w:p>
       <w:pPr>
         <w:pStyle w:val="Heading1"/>
@@ -255,13 +261,13 @@
         <w:t xml:space="preserve">4. ALCANCE DE LOS SERVICIOS</w:t>
       </w:r>
     </w:p>
-    <w:bookmarkStart w:id="27" w:name="X36bd1368cb0e80c3295c31f591b94add44f05aa"/>
+    <w:bookmarkStart w:id="25" w:name="componente-jurídico-contractual"/>
     <w:p>
       <w:pPr>
         <w:pStyle w:val="Heading2"/>
       </w:pPr>
       <w:r>
-        <w:t xml:space="preserve">4.1 Componente Jurídico-Contractual (D &amp; A Asociados)</w:t>
+        <w:t xml:space="preserve">4.1 Componente Jurídico-Contractual</w:t>
       </w:r>
     </w:p>
     <w:p>
@@ -324,14 +330,14 @@
         <w:t xml:space="preserve">Matrices de riesgos jurídicos.</w:t>
       </w:r>
     </w:p>
-    <w:bookmarkEnd w:id="27"/>
-    <w:bookmarkStart w:id="28" w:name="componente-financiero-d-a-asociados"/>
+    <w:bookmarkEnd w:id="25"/>
+    <w:bookmarkStart w:id="26" w:name="componente-financiero"/>
     <w:p>
       <w:pPr>
         <w:pStyle w:val="Heading2"/>
       </w:pPr>
       <w:r>
-        <w:t xml:space="preserve">4.2 Componente Financiero (D &amp; A Asociados)</w:t>
+        <w:t xml:space="preserve">4.2 Componente Financiero</w:t>
       </w:r>
     </w:p>
     <w:p>
@@ -370,14 +376,14 @@
         <w:t xml:space="preserve">Análisis de sostenibilidad económica del proyecto.</w:t>
       </w:r>
     </w:p>
-    <w:bookmarkEnd w:id="28"/>
-    <w:bookmarkStart w:id="29" w:name="X9f14902e0ba1db8c345f725a5284f103ea14a2b"/>
+    <w:bookmarkEnd w:id="26"/>
+    <w:bookmarkStart w:id="27" w:name="componente-técnico-operativo"/>
     <w:p>
       <w:pPr>
         <w:pStyle w:val="Heading2"/>
       </w:pPr>
       <w:r>
-        <w:t xml:space="preserve">4.3 Componente Técnico-Operativo (D &amp; A Asociados)</w:t>
+        <w:t xml:space="preserve">4.3 Componente Técnico-Operativo</w:t>
       </w:r>
     </w:p>
     <w:p>
@@ -428,14 +434,14 @@
         <w:t xml:space="preserve">Levantamiento y análisis de información de mercado mediante consulta a potenciales proveedores.</w:t>
       </w:r>
     </w:p>
-    <w:bookmarkEnd w:id="29"/>
-    <w:bookmarkStart w:id="30" w:name="componente-tecnológico-its-innovadataco"/>
+    <w:bookmarkEnd w:id="27"/>
+    <w:bookmarkStart w:id="28" w:name="componente-tecnológico-its"/>
     <w:p>
       <w:pPr>
         <w:pStyle w:val="Heading2"/>
       </w:pPr>
       <w:r>
-        <w:t xml:space="preserve">4.4 Componente Tecnológico ITS (InnovaDataCO)</w:t>
+        <w:t xml:space="preserve">4.4 Componente Tecnológico ITS</w:t>
       </w:r>
     </w:p>
     <w:p>
@@ -529,9 +535,9 @@
         </w:pict>
       </w:r>
     </w:p>
-    <w:bookmarkEnd w:id="30"/>
-    <w:bookmarkEnd w:id="31"/>
-    <w:bookmarkStart w:id="34" w:name="gobernanza-del-proyecto"/>
+    <w:bookmarkEnd w:id="28"/>
+    <w:bookmarkEnd w:id="29"/>
+    <w:bookmarkStart w:id="30" w:name="gobernanza-del-proyecto"/>
     <w:p>
       <w:pPr>
         <w:pStyle w:val="Heading1"/>
@@ -540,13 +546,28 @@
         <w:t xml:space="preserve">5. GOBERNANZA DEL PROYECTO</w:t>
       </w:r>
     </w:p>
-    <w:bookmarkStart w:id="32" w:name="director-del-proyecto-d-a-asociados"/>
-    <w:p>
-      <w:pPr>
-        <w:pStyle w:val="Heading2"/>
-      </w:pPr>
-      <w:r>
-        <w:t xml:space="preserve">5.1 Director del Proyecto (D &amp; A Asociados)</w:t>
+    <w:p>
+      <w:pPr>
+        <w:pStyle w:val="FirstParagraph"/>
+      </w:pPr>
+      <w:r>
+        <w:t xml:space="preserve">D &amp; A Asociados S.A.S. designará un</w:t>
+      </w:r>
+      <w:r>
+        <w:t xml:space="preserve"> </w:t>
+      </w:r>
+      <w:r>
+        <w:rPr>
+          <w:bCs/>
+          <w:b/>
+        </w:rPr>
+        <w:t xml:space="preserve">Director del Proyecto</w:t>
+      </w:r>
+      <w:r>
+        <w:t xml:space="preserve"> </w:t>
+      </w:r>
+      <w:r>
+        <w:t xml:space="preserve">encargado de:</w:t>
       </w:r>
     </w:p>
     <w:p>
@@ -594,53 +615,19 @@
         <w:pStyle w:val="Compact"/>
       </w:pPr>
       <w:r>
-        <w:t xml:space="preserve">Garantizar la integración de los componentes jurídico, financiero, técnico y tecnológico.</w:t>
-      </w:r>
-    </w:p>
-    <w:bookmarkEnd w:id="32"/>
-    <w:bookmarkStart w:id="33" w:name="líder-tecnológico-its-innovadataco"/>
-    <w:p>
-      <w:pPr>
-        <w:pStyle w:val="Heading2"/>
-      </w:pPr>
-      <w:r>
-        <w:t xml:space="preserve">5.2 Líder Tecnológico ITS (InnovaDataCO)</w:t>
+        <w:t xml:space="preserve">Garantizar la integración de los componentes jurídico, financiero, técnico y tecnológico;</w:t>
       </w:r>
     </w:p>
     <w:p>
       <w:pPr>
         <w:numPr>
           <w:ilvl w:val="0"/>
-          <w:numId w:val="1007"/>
+          <w:numId w:val="1006"/>
         </w:numPr>
         <w:pStyle w:val="Compact"/>
       </w:pPr>
       <w:r>
-        <w:t xml:space="preserve">Actuar como interlocutor técnico principal para la validación de entregables de documentos tecnológicos;</w:t>
-      </w:r>
-    </w:p>
-    <w:p>
-      <w:pPr>
-        <w:numPr>
-          <w:ilvl w:val="0"/>
-          <w:numId w:val="1007"/>
-        </w:numPr>
-        <w:pStyle w:val="Compact"/>
-      </w:pPr>
-      <w:r>
-        <w:t xml:space="preserve">Articulación con actores institucionales, proveedores tecnológicos y grupos de interés;</w:t>
-      </w:r>
-    </w:p>
-    <w:p>
-      <w:pPr>
-        <w:numPr>
-          <w:ilvl w:val="0"/>
-          <w:numId w:val="1007"/>
-        </w:numPr>
-        <w:pStyle w:val="Compact"/>
-      </w:pPr>
-      <w:r>
-        <w:t xml:space="preserve">Garantizar la alineación de la arquitectura tecnológica con los objetivos del SETP.</w:t>
+        <w:t xml:space="preserve">Articular la validación de documentos tecnológicos con actores institucionales, proveedores tecnológicos y grupos de interés.</w:t>
       </w:r>
     </w:p>
     <w:p>
@@ -650,9 +637,8 @@
         </w:pict>
       </w:r>
     </w:p>
-    <w:bookmarkEnd w:id="33"/>
-    <w:bookmarkEnd w:id="34"/>
-    <w:bookmarkStart w:id="35" w:name="equipo-de-trabajo"/>
+    <w:bookmarkEnd w:id="30"/>
+    <w:bookmarkStart w:id="31" w:name="equipo-de-trabajo"/>
     <w:p>
       <w:pPr>
         <w:pStyle w:val="Heading1"/>
@@ -669,10 +655,9 @@
         <w:jc w:val="start"/>
       </w:tblPr>
       <w:tblGrid>
-        <w:gridCol w:w="1911"/>
-        <w:gridCol w:w="2457"/>
-        <w:gridCol w:w="2184"/>
-        <w:gridCol w:w="1365"/>
+        <w:gridCol w:w="2772"/>
+        <w:gridCol w:w="3168"/>
+        <w:gridCol w:w="1980"/>
       </w:tblGrid>
       <w:tr>
         <w:trPr>
@@ -698,18 +683,6 @@
               <w:jc w:val="left"/>
             </w:pPr>
             <w:r>
-              <w:t xml:space="preserve">Empresa</w:t>
-            </w:r>
-          </w:p>
-        </w:tc>
-        <w:tc>
-          <w:tcPr/>
-          <w:p>
-            <w:pPr>
-              <w:pStyle w:val="Compact"/>
-              <w:jc w:val="left"/>
-            </w:pPr>
-            <w:r>
               <w:t xml:space="preserve">Perfil</w:t>
             </w:r>
           </w:p>
@@ -723,156 +696,6 @@
             </w:pPr>
             <w:r>
               <w:t xml:space="preserve">Rol</w:t>
-            </w:r>
-          </w:p>
-        </w:tc>
-      </w:tr>
-      <w:tr>
-        <w:tc>
-          <w:tcPr/>
-          <w:p>
-            <w:pPr>
-              <w:pStyle w:val="Compact"/>
-              <w:jc w:val="left"/>
-            </w:pPr>
-            <w:r>
-              <w:t xml:space="preserve">Director Jurídico del Proyecto</w:t>
-            </w:r>
-          </w:p>
-        </w:tc>
-        <w:tc>
-          <w:tcPr/>
-          <w:p>
-            <w:pPr>
-              <w:pStyle w:val="Compact"/>
-              <w:jc w:val="left"/>
-            </w:pPr>
-            <w:r>
-              <w:t xml:space="preserve">D &amp; A Asociados</w:t>
-            </w:r>
-          </w:p>
-        </w:tc>
-        <w:tc>
-          <w:tcPr/>
-          <w:p>
-            <w:pPr>
-              <w:pStyle w:val="Compact"/>
-              <w:jc w:val="left"/>
-            </w:pPr>
-            <w:r>
-              <w:t xml:space="preserve">Abogado especialista en derecho del transporte, con experiencia en estructuración jurídica y contractual de proyectos de infraestructura, transporte y contratación pública.</w:t>
-            </w:r>
-          </w:p>
-        </w:tc>
-        <w:tc>
-          <w:tcPr/>
-          <w:p>
-            <w:pPr>
-              <w:pStyle w:val="Compact"/>
-              <w:jc w:val="left"/>
-            </w:pPr>
-            <w:r>
-              <w:t xml:space="preserve">Liderar la estructuración jurídica y contractual del proyecto, coordinar la consultoría, participar en las mesas técnicas, elaborar y revisar los documentos jurídicos requeridos, formular recomendaciones sobre la arquitectura contractual y acompañar los procesos precontractuales y de selección.</w:t>
-            </w:r>
-          </w:p>
-        </w:tc>
-      </w:tr>
-      <w:tr>
-        <w:tc>
-          <w:tcPr/>
-          <w:p>
-            <w:pPr>
-              <w:pStyle w:val="Compact"/>
-              <w:jc w:val="left"/>
-            </w:pPr>
-            <w:r>
-              <w:t xml:space="preserve">Profesional Técnico</w:t>
-            </w:r>
-          </w:p>
-        </w:tc>
-        <w:tc>
-          <w:tcPr/>
-          <w:p>
-            <w:pPr>
-              <w:pStyle w:val="Compact"/>
-              <w:jc w:val="left"/>
-            </w:pPr>
-            <w:r>
-              <w:t xml:space="preserve">D &amp; A Asociados</w:t>
-            </w:r>
-          </w:p>
-        </w:tc>
-        <w:tc>
-          <w:tcPr/>
-          <w:p>
-            <w:pPr>
-              <w:pStyle w:val="Compact"/>
-              <w:jc w:val="left"/>
-            </w:pPr>
-            <w:r>
-              <w:t xml:space="preserve">Profesional con experiencia en planeación, estructuración, implementación y/o operación de sistemas de transporte público y sistemas tecnológicos asociados al transporte.</w:t>
-            </w:r>
-          </w:p>
-        </w:tc>
-        <w:tc>
-          <w:tcPr/>
-          <w:p>
-            <w:pPr>
-              <w:pStyle w:val="Compact"/>
-              <w:jc w:val="left"/>
-            </w:pPr>
-            <w:r>
-              <w:t xml:space="preserve">Apoyar el análisis de los componentes técnicos, operativos y tecnológicos del SETP, participar en las mesas técnicas y aportar insumos para la definición de requerimientos y condiciones técnicas de los futuros procesos de contratación.</w:t>
-            </w:r>
-          </w:p>
-        </w:tc>
-      </w:tr>
-      <w:tr>
-        <w:tc>
-          <w:tcPr/>
-          <w:p>
-            <w:pPr>
-              <w:pStyle w:val="Compact"/>
-              <w:jc w:val="left"/>
-            </w:pPr>
-            <w:r>
-              <w:t xml:space="preserve">Profesional Financiero</w:t>
-            </w:r>
-          </w:p>
-        </w:tc>
-        <w:tc>
-          <w:tcPr/>
-          <w:p>
-            <w:pPr>
-              <w:pStyle w:val="Compact"/>
-              <w:jc w:val="left"/>
-            </w:pPr>
-            <w:r>
-              <w:t xml:space="preserve">D &amp; A Asociados</w:t>
-            </w:r>
-          </w:p>
-        </w:tc>
-        <w:tc>
-          <w:tcPr/>
-          <w:p>
-            <w:pPr>
-              <w:pStyle w:val="Compact"/>
-              <w:jc w:val="left"/>
-            </w:pPr>
-            <w:r>
-              <w:t xml:space="preserve">Profesional con experiencia en estructuración financiera, evaluación económica y análisis de sostenibilidad de proyectos de transporte e infraestructura.</w:t>
-            </w:r>
-          </w:p>
-        </w:tc>
-        <w:tc>
-          <w:tcPr/>
-          <w:p>
-            <w:pPr>
-              <w:pStyle w:val="Compact"/>
-              <w:jc w:val="left"/>
-            </w:pPr>
-            <w:r>
-              <w:t xml:space="preserve">Apoyar la definición y validación de los componentes financieros requeridos para la estructuración de los procesos de contratación, así como el análisis de alternativas y modelos de implementación desde la perspectiva económica y financiera.</w:t>
             </w:r>
           </w:p>
         </w:tc>
@@ -890,10 +713,36 @@
                 <w:bCs/>
                 <w:b/>
               </w:rPr>
-              <w:t xml:space="preserve">Líder Tecnológico ITS</w:t>
-            </w:r>
-          </w:p>
-        </w:tc>
+              <w:t xml:space="preserve">Director Jurídico del Proyecto</w:t>
+            </w:r>
+          </w:p>
+        </w:tc>
+        <w:tc>
+          <w:tcPr/>
+          <w:p>
+            <w:pPr>
+              <w:pStyle w:val="Compact"/>
+              <w:jc w:val="left"/>
+            </w:pPr>
+            <w:r>
+              <w:t xml:space="preserve">Abogado especialista en derecho del transporte, con experiencia en estructuración jurídica y contractual de proyectos de infraestructura, transporte y contratación pública.</w:t>
+            </w:r>
+          </w:p>
+        </w:tc>
+        <w:tc>
+          <w:tcPr/>
+          <w:p>
+            <w:pPr>
+              <w:pStyle w:val="Compact"/>
+              <w:jc w:val="left"/>
+            </w:pPr>
+            <w:r>
+              <w:t xml:space="preserve">Liderar la estructuración jurídica y contractual del proyecto, coordinar la consultoría, participar en las mesas técnicas, elaborar y revisar los documentos jurídicos requeridos, formular recomendaciones sobre la arquitectura contractual y acompañar los procesos precontractuales y de selección.</w:t>
+            </w:r>
+          </w:p>
+        </w:tc>
+      </w:tr>
+      <w:tr>
         <w:tc>
           <w:tcPr/>
           <w:p>
@@ -906,10 +755,36 @@
                 <w:bCs/>
                 <w:b/>
               </w:rPr>
-              <w:t xml:space="preserve">InnovaDataCO</w:t>
-            </w:r>
-          </w:p>
-        </w:tc>
+              <w:t xml:space="preserve">Profesional Técnico</w:t>
+            </w:r>
+          </w:p>
+        </w:tc>
+        <w:tc>
+          <w:tcPr/>
+          <w:p>
+            <w:pPr>
+              <w:pStyle w:val="Compact"/>
+              <w:jc w:val="left"/>
+            </w:pPr>
+            <w:r>
+              <w:t xml:space="preserve">Profesional con experiencia en planeación, estructuración, implementación y/o operación de sistemas de transporte público y sistemas tecnológicos asociados al transporte.</w:t>
+            </w:r>
+          </w:p>
+        </w:tc>
+        <w:tc>
+          <w:tcPr/>
+          <w:p>
+            <w:pPr>
+              <w:pStyle w:val="Compact"/>
+              <w:jc w:val="left"/>
+            </w:pPr>
+            <w:r>
+              <w:t xml:space="preserve">Apoyar el análisis de los componentes técnicos, operativos y tecnológicos del SETP, participar en las mesas técnicas y aportar insumos para la definición de requerimientos y condiciones técnicas de los futuros procesos de contratación.</w:t>
+            </w:r>
+          </w:p>
+        </w:tc>
+      </w:tr>
+      <w:tr>
         <w:tc>
           <w:tcPr/>
           <w:p>
@@ -922,10 +797,36 @@
                 <w:bCs/>
                 <w:b/>
               </w:rPr>
-              <w:t xml:space="preserve">Profesional especializado en sistemas ITS, arquitectura tecnológica, ingeniería de sistemas y diseño de soluciones tecnológicas para transporte inteligente.</w:t>
-            </w:r>
-          </w:p>
-        </w:tc>
+              <w:t xml:space="preserve">Profesional Financiero</w:t>
+            </w:r>
+          </w:p>
+        </w:tc>
+        <w:tc>
+          <w:tcPr/>
+          <w:p>
+            <w:pPr>
+              <w:pStyle w:val="Compact"/>
+              <w:jc w:val="left"/>
+            </w:pPr>
+            <w:r>
+              <w:t xml:space="preserve">Profesional con experiencia en estructuración financiera, evaluación económica y análisis de sostenibilidad de proyectos de transporte e infraestructura.</w:t>
+            </w:r>
+          </w:p>
+        </w:tc>
+        <w:tc>
+          <w:tcPr/>
+          <w:p>
+            <w:pPr>
+              <w:pStyle w:val="Compact"/>
+              <w:jc w:val="left"/>
+            </w:pPr>
+            <w:r>
+              <w:t xml:space="preserve">Apoyar la definición y validación de los componentes financieros requeridos para la estructuración de los procesos de contratación, así como el análisis de alternativas y modelos de implementación desde la perspectiva económica y financiera.</w:t>
+            </w:r>
+          </w:p>
+        </w:tc>
+      </w:tr>
+      <w:tr>
         <w:tc>
           <w:tcPr/>
           <w:p>
@@ -938,6 +839,30 @@
                 <w:bCs/>
                 <w:b/>
               </w:rPr>
+              <w:t xml:space="preserve">Profesional Tecnológico ITS</w:t>
+            </w:r>
+          </w:p>
+        </w:tc>
+        <w:tc>
+          <w:tcPr/>
+          <w:p>
+            <w:pPr>
+              <w:pStyle w:val="Compact"/>
+              <w:jc w:val="left"/>
+            </w:pPr>
+            <w:r>
+              <w:t xml:space="preserve">Profesional especializado en sistemas ITS, arquitectura tecnológica, ingeniería de sistemas y diseño de soluciones tecnológicas para transporte inteligente.</w:t>
+            </w:r>
+          </w:p>
+        </w:tc>
+        <w:tc>
+          <w:tcPr/>
+          <w:p>
+            <w:pPr>
+              <w:pStyle w:val="Compact"/>
+              <w:jc w:val="left"/>
+            </w:pPr>
+            <w:r>
               <w:t xml:space="preserve">Liderar la definición, diseño conceptual y especificación de los componentes tecnológicos ITS del SETP; revisar y clasificar subsistemas ITS; definir arquitectura tecnológica conceptual; especificar requerimientos funcionales y no funcionales; elaborar RFI/RFQ tecnológica.</w:t>
             </w:r>
           </w:p>
@@ -952,19 +877,11 @@
               <w:jc w:val="left"/>
             </w:pPr>
             <w:r>
+              <w:rPr>
+                <w:bCs/>
+                <w:b/>
+              </w:rPr>
               <w:t xml:space="preserve">Apoyo Administrativo</w:t>
-            </w:r>
-          </w:p>
-        </w:tc>
-        <w:tc>
-          <w:tcPr/>
-          <w:p>
-            <w:pPr>
-              <w:pStyle w:val="Compact"/>
-              <w:jc w:val="left"/>
-            </w:pPr>
-            <w:r>
-              <w:t xml:space="preserve">D &amp; A Asociados</w:t>
             </w:r>
           </w:p>
         </w:tc>
@@ -1001,8 +918,8 @@
         </w:pict>
       </w:r>
     </w:p>
-    <w:bookmarkEnd w:id="35"/>
-    <w:bookmarkStart w:id="39" w:name="productos-entregables-y-forma-de-pago"/>
+    <w:bookmarkEnd w:id="31"/>
+    <w:bookmarkStart w:id="35" w:name="productos-entregables-y-forma-de-pago"/>
     <w:p>
       <w:pPr>
         <w:pStyle w:val="Heading1"/>
@@ -1026,7 +943,7 @@
         </w:pict>
       </w:r>
     </w:p>
-    <w:bookmarkStart w:id="36" w:name="X73f078129a123f767e03e8b8f1d6ad9c4d734b9"/>
+    <w:bookmarkStart w:id="32" w:name="X73f078129a123f767e03e8b8f1d6ad9c4d734b9"/>
     <w:p>
       <w:pPr>
         <w:pStyle w:val="Heading2"/>
@@ -1044,7 +961,7 @@
           <w:bCs/>
           <w:b/>
         </w:rPr>
-        <w:t xml:space="preserve">Porcentaje de pago: 40% — $15.600.000 COP</w:t>
+        <w:t xml:space="preserve">Porcentaje de pago: 40%</w:t>
       </w:r>
     </w:p>
     <w:p>
@@ -1380,8 +1297,8 @@
         </w:pict>
       </w:r>
     </w:p>
-    <w:bookmarkEnd w:id="36"/>
-    <w:bookmarkStart w:id="37" w:name="X34d686f6629ca9674c8dfc23a803f014b7c3b93"/>
+    <w:bookmarkEnd w:id="32"/>
+    <w:bookmarkStart w:id="33" w:name="X34d686f6629ca9674c8dfc23a803f014b7c3b93"/>
     <w:p>
       <w:pPr>
         <w:pStyle w:val="Heading2"/>
@@ -1399,15 +1316,7 @@
           <w:bCs/>
           <w:b/>
         </w:rPr>
-        <w:t xml:space="preserve">Porcentaje de pago: 30% — $11.700.000 COP</w:t>
-      </w:r>
-    </w:p>
-    <w:p>
-      <w:pPr>
-        <w:pStyle w:val="BodyText"/>
-      </w:pPr>
-      <w:r>
-        <w:t xml:space="preserve">Documento que contenga:</w:t>
+        <w:t xml:space="preserve">Porcentaje de pago: 30%</w:t>
       </w:r>
     </w:p>
     <w:tbl>
@@ -2175,8 +2084,8 @@
         </w:pict>
       </w:r>
     </w:p>
-    <w:bookmarkEnd w:id="37"/>
-    <w:bookmarkStart w:id="38" w:name="X54047205071cfe90528eb8baf3dc7b2802953bc"/>
+    <w:bookmarkEnd w:id="33"/>
+    <w:bookmarkStart w:id="34" w:name="X54047205071cfe90528eb8baf3dc7b2802953bc"/>
     <w:p>
       <w:pPr>
         <w:pStyle w:val="Heading2"/>
@@ -2194,15 +2103,7 @@
           <w:bCs/>
           <w:b/>
         </w:rPr>
-        <w:t xml:space="preserve">Porcentaje de pago: 30% — $11.700.000 COP</w:t>
-      </w:r>
-    </w:p>
-    <w:p>
-      <w:pPr>
-        <w:pStyle w:val="BodyText"/>
-      </w:pPr>
-      <w:r>
-        <w:t xml:space="preserve">Entrega de los documentos requeridos para la preparación de los procesos de contratación:</w:t>
+        <w:t xml:space="preserve">Porcentaje de pago: 30%</w:t>
       </w:r>
     </w:p>
     <w:tbl>
@@ -2746,9 +2647,9 @@
         </w:pict>
       </w:r>
     </w:p>
-    <w:bookmarkEnd w:id="38"/>
-    <w:bookmarkEnd w:id="39"/>
-    <w:bookmarkStart w:id="40" w:name="cronograma-de-ejecución"/>
+    <w:bookmarkEnd w:id="34"/>
+    <w:bookmarkEnd w:id="35"/>
+    <w:bookmarkStart w:id="36" w:name="cronograma-de-ejecución"/>
     <w:p>
       <w:pPr>
         <w:pStyle w:val="Heading1"/>
@@ -2962,8 +2863,8 @@
         </w:pict>
       </w:r>
     </w:p>
-    <w:bookmarkEnd w:id="40"/>
-    <w:bookmarkStart w:id="44" w:name="X1042abcd793d40b6ab7c80bfa319de613766061"/>
+    <w:bookmarkEnd w:id="36"/>
+    <w:bookmarkStart w:id="40" w:name="X1042abcd793d40b6ab7c80bfa319de613766061"/>
     <w:p>
       <w:pPr>
         <w:pStyle w:val="Heading1"/>
@@ -2972,7 +2873,7 @@
         <w:t xml:space="preserve">9. CONDICIONES DE EJECUCIÓN Y APROBACIÓN DE ENTREGABLES</w:t>
       </w:r>
     </w:p>
-    <w:bookmarkStart w:id="41" w:name="lugar-de-ejecución"/>
+    <w:bookmarkStart w:id="37" w:name="lugar-de-ejecución"/>
     <w:p>
       <w:pPr>
         <w:pStyle w:val="Heading2"/>
@@ -2989,8 +2890,8 @@
         <w:t xml:space="preserve">Todos los productos, documentos técnicos, análisis, estudios y demás entregables serán desarrollados desde la ciudad de Bogotá D.C., sin perjuicio de la realización de reuniones virtuales o presenciales que sean requeridas por Metro Sabanas S.A.S. En caso de requerirse desplazamientos presenciales fuera de Bogotá D.C., los costos de transporte, alojamiento y viáticos serán asumidos por Metro Sabanas S.A.S. o acordados previamente entre las partes.</w:t>
       </w:r>
     </w:p>
-    <w:bookmarkEnd w:id="41"/>
-    <w:bookmarkStart w:id="42" w:name="revisión-y-aprobación-de-entregables"/>
+    <w:bookmarkEnd w:id="37"/>
+    <w:bookmarkStart w:id="38" w:name="revisión-y-aprobación-de-entregables"/>
     <w:p>
       <w:pPr>
         <w:pStyle w:val="Heading2"/>
@@ -3007,8 +2908,8 @@
         <w:t xml:space="preserve">Una vez entregado cada producto, Metro Sabanas S.A.S. contará con un plazo máximo de cinco (5) días hábiles para realizar la revisión correspondiente y comunicar por escrito las observaciones, ajustes o correcciones. En caso de que, transcurrido dicho término, no se reciban observaciones, el entregable se entenderá aprobado a satisfacción para todos los efectos contractuales y de facturación.</w:t>
       </w:r>
     </w:p>
-    <w:bookmarkEnd w:id="42"/>
-    <w:bookmarkStart w:id="43" w:name="ajustes-a-los-entregables"/>
+    <w:bookmarkEnd w:id="38"/>
+    <w:bookmarkStart w:id="39" w:name="ajustes-a-los-entregables"/>
     <w:p>
       <w:pPr>
         <w:pStyle w:val="Heading2"/>
@@ -3022,7 +2923,7 @@
         <w:pStyle w:val="FirstParagraph"/>
       </w:pPr>
       <w:r>
-        <w:t xml:space="preserve">Las observaciones presentadas por Metro Sabanas S.A.S. deberán corresponder al alcance definido en la presente propuesta. Los proponentes realizarán los ajustes que resulten procedentes y entregarán la versión ajustada para su validación final.</w:t>
+        <w:t xml:space="preserve">Las observaciones presentadas por Metro Sabanas S.A.S. deberán corresponder al alcance definido en la presente propuesta. Los ajustes que resulten procedentes serán atendidos y la versión ajustada entregada para su validación final.</w:t>
       </w:r>
     </w:p>
     <w:p>
@@ -3032,9 +2933,9 @@
         </w:pict>
       </w:r>
     </w:p>
-    <w:bookmarkEnd w:id="43"/>
-    <w:bookmarkEnd w:id="44"/>
-    <w:bookmarkStart w:id="45" w:name="Xe232b04bfff2ea76a2551735d3abb2180f23df8"/>
+    <w:bookmarkEnd w:id="39"/>
+    <w:bookmarkEnd w:id="40"/>
+    <w:bookmarkStart w:id="41" w:name="Xe232b04bfff2ea76a2551735d3abb2180f23df8"/>
     <w:p>
       <w:pPr>
         <w:pStyle w:val="Heading1"/>
@@ -3058,8 +2959,8 @@
         </w:pict>
       </w:r>
     </w:p>
-    <w:bookmarkEnd w:id="45"/>
-    <w:bookmarkStart w:id="46" w:name="propiedad-intelectual"/>
+    <w:bookmarkEnd w:id="41"/>
+    <w:bookmarkStart w:id="42" w:name="propiedad-intelectual"/>
     <w:p>
       <w:pPr>
         <w:pStyle w:val="Heading1"/>
@@ -3073,7 +2974,7 @@
         <w:pStyle w:val="FirstParagraph"/>
       </w:pPr>
       <w:r>
-        <w:t xml:space="preserve">Los documentos, análisis, diseños conceptuales y demás productos elaborados en ejecución de la presente propuesta serán entregados a Metro Sabanas S.A.S. para su utilización dentro del proyecto SETP Sincelejo. Los proponentes conservarán la titularidad sobre sus metodologías, modelos, herramientas, plantillas y conocimiento especializado utilizados para la elaboración de los productos.</w:t>
+        <w:t xml:space="preserve">Los documentos, análisis, diseños conceptuales y demás productos elaborados en ejecución de la presente propuesta serán entregados a Metro Sabanas S.A.S. para su utilización dentro del proyecto SETP Sincelejo. D &amp; A Asociados S.A.S. conservará la titularidad sobre sus metodologías, modelos, herramientas, plantillas y conocimiento especializado utilizados para la elaboración de los productos.</w:t>
       </w:r>
     </w:p>
     <w:p>
@@ -3083,8 +2984,8 @@
         </w:pict>
       </w:r>
     </w:p>
-    <w:bookmarkEnd w:id="46"/>
-    <w:bookmarkStart w:id="47" w:name="valor-y-forma-de-pago"/>
+    <w:bookmarkEnd w:id="42"/>
+    <w:bookmarkStart w:id="43" w:name="valor-y-forma-de-pago"/>
     <w:p>
       <w:pPr>
         <w:pStyle w:val="Heading1"/>
@@ -3516,8 +3417,8 @@
         </w:pict>
       </w:r>
     </w:p>
-    <w:bookmarkEnd w:id="47"/>
-    <w:bookmarkStart w:id="48" w:name="exclusiones-del-alcance"/>
+    <w:bookmarkEnd w:id="43"/>
+    <w:bookmarkStart w:id="44" w:name="exclusiones-del-alcance"/>
     <w:p>
       <w:pPr>
         <w:pStyle w:val="Heading1"/>
@@ -3538,7 +3439,7 @@
       <w:pPr>
         <w:numPr>
           <w:ilvl w:val="0"/>
-          <w:numId w:val="1008"/>
+          <w:numId w:val="1007"/>
         </w:numPr>
         <w:pStyle w:val="Compact"/>
       </w:pPr>
@@ -3550,7 +3451,7 @@
       <w:pPr>
         <w:numPr>
           <w:ilvl w:val="0"/>
-          <w:numId w:val="1008"/>
+          <w:numId w:val="1007"/>
         </w:numPr>
         <w:pStyle w:val="Compact"/>
       </w:pPr>
@@ -3562,7 +3463,7 @@
       <w:pPr>
         <w:numPr>
           <w:ilvl w:val="0"/>
-          <w:numId w:val="1008"/>
+          <w:numId w:val="1007"/>
         </w:numPr>
         <w:pStyle w:val="Compact"/>
       </w:pPr>
@@ -3574,7 +3475,7 @@
       <w:pPr>
         <w:numPr>
           <w:ilvl w:val="0"/>
-          <w:numId w:val="1008"/>
+          <w:numId w:val="1007"/>
         </w:numPr>
         <w:pStyle w:val="Compact"/>
       </w:pPr>
@@ -3586,7 +3487,7 @@
       <w:pPr>
         <w:numPr>
           <w:ilvl w:val="0"/>
-          <w:numId w:val="1008"/>
+          <w:numId w:val="1007"/>
         </w:numPr>
         <w:pStyle w:val="Compact"/>
       </w:pPr>
@@ -3598,7 +3499,7 @@
       <w:pPr>
         <w:numPr>
           <w:ilvl w:val="0"/>
-          <w:numId w:val="1008"/>
+          <w:numId w:val="1007"/>
         </w:numPr>
         <w:pStyle w:val="Compact"/>
       </w:pPr>
@@ -3613,8 +3514,8 @@
         </w:pict>
       </w:r>
     </w:p>
-    <w:bookmarkEnd w:id="48"/>
-    <w:bookmarkStart w:id="49" w:name="declaraciones"/>
+    <w:bookmarkEnd w:id="44"/>
+    <w:bookmarkStart w:id="45" w:name="declaraciones"/>
     <w:p>
       <w:pPr>
         <w:pStyle w:val="Heading1"/>
@@ -3628,7 +3529,7 @@
         <w:pStyle w:val="FirstParagraph"/>
       </w:pPr>
       <w:r>
-        <w:t xml:space="preserve">Los proponentes manifiestan expresamente no estar incursos en ninguna de las causales de inhabilidad e incompatibilidad establecidas en la Ley 1881 de 2016, incluida la derivada de la Ley 1918 de 2018.</w:t>
+        <w:t xml:space="preserve">El proponente manifiesta expresamente no estar incurso en ninguna de las causales de inhabilidad e incompatibilidad establecidas en la Ley 1881 de 2016, incluida la derivada de la Ley 1918 de 2018.</w:t>
       </w:r>
     </w:p>
     <w:p>
@@ -3638,14 +3539,14 @@
         </w:pict>
       </w:r>
     </w:p>
-    <w:bookmarkEnd w:id="49"/>
-    <w:bookmarkStart w:id="50" w:name="representantes-legales"/>
+    <w:bookmarkEnd w:id="45"/>
+    <w:bookmarkStart w:id="46" w:name="representante-legal"/>
     <w:p>
       <w:pPr>
         <w:pStyle w:val="Heading1"/>
       </w:pPr>
       <w:r>
-        <w:t xml:space="preserve">15. REPRESENTANTES LEGALES</w:t>
+        <w:t xml:space="preserve">15. REPRESENTANTE LEGAL</w:t>
       </w:r>
     </w:p>
     <w:p>
@@ -3740,83 +3641,6 @@
     </w:p>
     <w:p>
       <w:pPr>
-        <w:pStyle w:val="FirstParagraph"/>
-      </w:pPr>
-      <w:r>
-        <w:rPr>
-          <w:bCs/>
-          <w:b/>
-        </w:rPr>
-        <w:t xml:space="preserve">InnovaDataCO S.A.S.</w:t>
-      </w:r>
-      <w:r>
-        <w:br/>
-      </w:r>
-      <w:r>
-        <w:rPr>
-          <w:bCs/>
-          <w:b/>
-        </w:rPr>
-        <w:t xml:space="preserve">Representante Legal:</w:t>
-      </w:r>
-      <w:r>
-        <w:t xml:space="preserve"> </w:t>
-      </w:r>
-      <w:r>
-        <w:t xml:space="preserve">Diana Marcela Cáceres Valderrama</w:t>
-      </w:r>
-      <w:r>
-        <w:br/>
-      </w:r>
-      <w:r>
-        <w:rPr>
-          <w:bCs/>
-          <w:b/>
-        </w:rPr>
-        <w:t xml:space="preserve">Contacto:</w:t>
-      </w:r>
-      <w:r>
-        <w:t xml:space="preserve"> </w:t>
-      </w:r>
-      <w:r>
-        <w:t xml:space="preserve">gerencia@innovadataco.com</w:t>
-      </w:r>
-      <w:r>
-        <w:br/>
-      </w:r>
-      <w:r>
-        <w:rPr>
-          <w:bCs/>
-          <w:b/>
-        </w:rPr>
-        <w:t xml:space="preserve">InnovaDataCO</w:t>
-      </w:r>
-      <w:r>
-        <w:t xml:space="preserve"> </w:t>
-      </w:r>
-      <w:r>
-        <w:t xml:space="preserve">—</w:t>
-      </w:r>
-      <w:r>
-        <w:t xml:space="preserve"> </w:t>
-      </w:r>
-      <w:r>
-        <w:rPr>
-          <w:iCs/>
-          <w:i/>
-        </w:rPr>
-        <w:t xml:space="preserve">Ideas que conectan, resultados que transforman</w:t>
-      </w:r>
-    </w:p>
-    <w:p>
-      <w:r>
-        <w:pict>
-          <v:rect style="width:0;height:1.5pt" o:hralign="center" o:hrstd="t" o:hr="t"/>
-        </w:pict>
-      </w:r>
-    </w:p>
-    <w:p>
-      <w:pPr>
         <w:pStyle w:val="BlockText"/>
       </w:pPr>
       <w:r>
@@ -3841,7 +3665,7 @@
         <w:t xml:space="preserve">”</w:t>
       </w:r>
     </w:p>
-    <w:bookmarkEnd w:id="50"/>
+    <w:bookmarkEnd w:id="46"/>
     <w:sectPr/>
   </w:body>
 </w:document>
@@ -4046,9 +3870,6 @@
     <w:abstractNumId w:val="991"/>
   </w:num>
   <w:num w:numId="1007">
-    <w:abstractNumId w:val="991"/>
-  </w:num>
-  <w:num w:numId="1008">
     <w:abstractNumId w:val="991"/>
   </w:num>
 </w:numbering>

</xml_diff>

<commit_message>
SETP: v1.3 — Precios definidos (0M / 5M rebaja) + PM2 + Pendiente valoración Carolina
</commit_message>
<xml_diff>
--- a/PROYECTO-003-SETP-SINCELEJO/PROPUESTA-INTEGRAL-SETP-SINCELEJO.docx
+++ b/PROYECTO-003-SETP-SINCELEJO/PROPUESTA-INTEGRAL-SETP-SINCELEJO.docx
@@ -919,7 +919,7 @@
       </w:r>
     </w:p>
     <w:bookmarkEnd w:id="31"/>
-    <w:bookmarkStart w:id="35" w:name="productos-entregables-y-forma-de-pago"/>
+    <w:bookmarkStart w:id="36" w:name="productos-entregables-y-forma-de-pago"/>
     <w:p>
       <w:pPr>
         <w:pStyle w:val="Heading1"/>
@@ -961,7 +961,7 @@
           <w:bCs/>
           <w:b/>
         </w:rPr>
-        <w:t xml:space="preserve">Porcentaje de pago: 40%</w:t>
+        <w:t xml:space="preserve">Porcentaje de pago: 35% — $31.500.000</w:t>
       </w:r>
     </w:p>
     <w:p>
@@ -1316,7 +1316,7 @@
           <w:bCs/>
           <w:b/>
         </w:rPr>
-        <w:t xml:space="preserve">Porcentaje de pago: 30%</w:t>
+        <w:t xml:space="preserve">Porcentaje de pago: 25% — $22.500.000</w:t>
       </w:r>
     </w:p>
     <w:tbl>
@@ -2103,7 +2103,7 @@
           <w:bCs/>
           <w:b/>
         </w:rPr>
-        <w:t xml:space="preserve">Porcentaje de pago: 30%</w:t>
+        <w:t xml:space="preserve">Porcentaje de pago: 25% — $22.500.000</w:t>
       </w:r>
     </w:p>
     <w:tbl>
@@ -2640,6 +2640,54 @@
         <w:t xml:space="preserve">Contra entrega y aprobación de los productos 3.3 y 3.4.</w:t>
       </w:r>
     </w:p>
+    <w:bookmarkEnd w:id="34"/>
+    <w:bookmarkStart w:id="35" w:name="Xfc7aa38a42d111f47ac59aa48240ae2e178b823"/>
+    <w:p>
+      <w:pPr>
+        <w:pStyle w:val="Heading2"/>
+      </w:pPr>
+      <w:r>
+        <w:t xml:space="preserve">Producto No. 4. Acompañamiento a los Procesos de Selección y Cierre de la Consultoría</w:t>
+      </w:r>
+    </w:p>
+    <w:p>
+      <w:pPr>
+        <w:pStyle w:val="FirstParagraph"/>
+      </w:pPr>
+      <w:r>
+        <w:rPr>
+          <w:bCs/>
+          <w:b/>
+        </w:rPr>
+        <w:t xml:space="preserve">Porcentaje de pago: 15%</w:t>
+      </w:r>
+    </w:p>
+    <w:p>
+      <w:pPr>
+        <w:pStyle w:val="BodyText"/>
+      </w:pPr>
+      <w:r>
+        <w:t xml:space="preserve">Comprende el acompañamiento especializado durante los procesos de selección derivados de la estructuración realizada, incluyendo la atención de observaciones, ajustes a los documentos elaborados, emisión de conceptos y recomendaciones y la presentación del informe final de ejecución.</w:t>
+      </w:r>
+    </w:p>
+    <w:p>
+      <w:pPr>
+        <w:pStyle w:val="BodyText"/>
+      </w:pPr>
+      <w:r>
+        <w:rPr>
+          <w:bCs/>
+          <w:b/>
+        </w:rPr>
+        <w:t xml:space="preserve">Pago:</w:t>
+      </w:r>
+      <w:r>
+        <w:t xml:space="preserve"> </w:t>
+      </w:r>
+      <w:r>
+        <w:t xml:space="preserve">Contra entrega y aprobación del informe final y certificación de cumplimiento expedida por el supervisor del contrato.</w:t>
+      </w:r>
+    </w:p>
     <w:p>
       <w:r>
         <w:pict>
@@ -2647,9 +2695,9 @@
         </w:pict>
       </w:r>
     </w:p>
-    <w:bookmarkEnd w:id="34"/>
     <w:bookmarkEnd w:id="35"/>
-    <w:bookmarkStart w:id="36" w:name="cronograma-de-ejecución"/>
+    <w:bookmarkEnd w:id="36"/>
+    <w:bookmarkStart w:id="37" w:name="cronograma-de-ejecución"/>
     <w:p>
       <w:pPr>
         <w:pStyle w:val="Heading1"/>
@@ -2863,8 +2911,8 @@
         </w:pict>
       </w:r>
     </w:p>
-    <w:bookmarkEnd w:id="36"/>
-    <w:bookmarkStart w:id="40" w:name="X1042abcd793d40b6ab7c80bfa319de613766061"/>
+    <w:bookmarkEnd w:id="37"/>
+    <w:bookmarkStart w:id="41" w:name="X1042abcd793d40b6ab7c80bfa319de613766061"/>
     <w:p>
       <w:pPr>
         <w:pStyle w:val="Heading1"/>
@@ -2873,7 +2921,7 @@
         <w:t xml:space="preserve">9. CONDICIONES DE EJECUCIÓN Y APROBACIÓN DE ENTREGABLES</w:t>
       </w:r>
     </w:p>
-    <w:bookmarkStart w:id="37" w:name="lugar-de-ejecución"/>
+    <w:bookmarkStart w:id="38" w:name="lugar-de-ejecución"/>
     <w:p>
       <w:pPr>
         <w:pStyle w:val="Heading2"/>
@@ -2890,8 +2938,8 @@
         <w:t xml:space="preserve">Todos los productos, documentos técnicos, análisis, estudios y demás entregables serán desarrollados desde la ciudad de Bogotá D.C., sin perjuicio de la realización de reuniones virtuales o presenciales que sean requeridas por Metro Sabanas S.A.S. En caso de requerirse desplazamientos presenciales fuera de Bogotá D.C., los costos de transporte, alojamiento y viáticos serán asumidos por Metro Sabanas S.A.S. o acordados previamente entre las partes.</w:t>
       </w:r>
     </w:p>
-    <w:bookmarkEnd w:id="37"/>
-    <w:bookmarkStart w:id="38" w:name="revisión-y-aprobación-de-entregables"/>
+    <w:bookmarkEnd w:id="38"/>
+    <w:bookmarkStart w:id="39" w:name="revisión-y-aprobación-de-entregables"/>
     <w:p>
       <w:pPr>
         <w:pStyle w:val="Heading2"/>
@@ -2908,8 +2956,8 @@
         <w:t xml:space="preserve">Una vez entregado cada producto, Metro Sabanas S.A.S. contará con un plazo máximo de cinco (5) días hábiles para realizar la revisión correspondiente y comunicar por escrito las observaciones, ajustes o correcciones. En caso de que, transcurrido dicho término, no se reciban observaciones, el entregable se entenderá aprobado a satisfacción para todos los efectos contractuales y de facturación.</w:t>
       </w:r>
     </w:p>
-    <w:bookmarkEnd w:id="38"/>
-    <w:bookmarkStart w:id="39" w:name="ajustes-a-los-entregables"/>
+    <w:bookmarkEnd w:id="39"/>
+    <w:bookmarkStart w:id="40" w:name="ajustes-a-los-entregables"/>
     <w:p>
       <w:pPr>
         <w:pStyle w:val="Heading2"/>
@@ -2933,9 +2981,9 @@
         </w:pict>
       </w:r>
     </w:p>
-    <w:bookmarkEnd w:id="39"/>
     <w:bookmarkEnd w:id="40"/>
-    <w:bookmarkStart w:id="41" w:name="Xe232b04bfff2ea76a2551735d3abb2180f23df8"/>
+    <w:bookmarkEnd w:id="41"/>
+    <w:bookmarkStart w:id="42" w:name="Xe232b04bfff2ea76a2551735d3abb2180f23df8"/>
     <w:p>
       <w:pPr>
         <w:pStyle w:val="Heading1"/>
@@ -2959,8 +3007,8 @@
         </w:pict>
       </w:r>
     </w:p>
-    <w:bookmarkEnd w:id="41"/>
-    <w:bookmarkStart w:id="42" w:name="propiedad-intelectual"/>
+    <w:bookmarkEnd w:id="42"/>
+    <w:bookmarkStart w:id="43" w:name="propiedad-intelectual"/>
     <w:p>
       <w:pPr>
         <w:pStyle w:val="Heading1"/>
@@ -2984,8 +3032,8 @@
         </w:pict>
       </w:r>
     </w:p>
-    <w:bookmarkEnd w:id="42"/>
-    <w:bookmarkStart w:id="43" w:name="valor-y-forma-de-pago"/>
+    <w:bookmarkEnd w:id="43"/>
+    <w:bookmarkStart w:id="44" w:name="valor-y-forma-de-pago"/>
     <w:p>
       <w:pPr>
         <w:pStyle w:val="Heading1"/>
@@ -3043,10 +3091,50 @@
               <w:jc w:val="left"/>
             </w:pPr>
             <w:r>
-              <w:t xml:space="preserve">Estructuración integral técnica, jurídica, financiera y tecnológica del SETP Sincelejo — Incluyendo componente ITS, arquitectura tecnológica, especificaciones, RFI/RFQ y acompañamiento precontractual</w:t>
-            </w:r>
-          </w:p>
-        </w:tc>
+              <w:t xml:space="preserve">Estructuración técnica, jurídica, financiera y tecnológica del SETP Sincelejo (Productos 1-3)</w:t>
+            </w:r>
+          </w:p>
+        </w:tc>
+        <w:tc>
+          <w:tcPr/>
+          <w:p>
+            <w:pPr>
+              <w:pStyle w:val="Compact"/>
+              <w:jc w:val="left"/>
+            </w:pPr>
+            <w:r>
+              <w:t xml:space="preserve">$70.000.000</w:t>
+            </w:r>
+          </w:p>
+        </w:tc>
+      </w:tr>
+      <w:tr>
+        <w:tc>
+          <w:tcPr/>
+          <w:p>
+            <w:pPr>
+              <w:pStyle w:val="Compact"/>
+              <w:jc w:val="left"/>
+            </w:pPr>
+            <w:r>
+              <w:t xml:space="preserve">Acompañamiento a procesos de selección — 3 meses adicionales (Producto 4)</w:t>
+            </w:r>
+          </w:p>
+        </w:tc>
+        <w:tc>
+          <w:tcPr/>
+          <w:p>
+            <w:pPr>
+              <w:pStyle w:val="Compact"/>
+              <w:jc w:val="left"/>
+            </w:pPr>
+            <w:r>
+              <w:t xml:space="preserve">$20.000.000</w:t>
+            </w:r>
+          </w:p>
+        </w:tc>
+      </w:tr>
+      <w:tr>
         <w:tc>
           <w:tcPr/>
           <w:p>
@@ -3059,12 +3147,10 @@
                 <w:bCs/>
                 <w:b/>
               </w:rPr>
-              <w:t xml:space="preserve">A definir</w:t>
-            </w:r>
-          </w:p>
-        </w:tc>
-      </w:tr>
-      <w:tr>
+              <w:t xml:space="preserve">Valor total sin impuestos (IVA, estampillas territoriales por separado)</w:t>
+            </w:r>
+          </w:p>
+        </w:tc>
         <w:tc>
           <w:tcPr/>
           <w:p>
@@ -3077,10 +3163,12 @@
                 <w:bCs/>
                 <w:b/>
               </w:rPr>
-              <w:t xml:space="preserve">Valor total (IVA + impuestos incluidos)</w:t>
-            </w:r>
-          </w:p>
-        </w:tc>
+              <w:t xml:space="preserve">$90.000.000</w:t>
+            </w:r>
+          </w:p>
+        </w:tc>
+      </w:tr>
+      <w:tr>
         <w:tc>
           <w:tcPr/>
           <w:p>
@@ -3090,15 +3178,49 @@
             </w:pPr>
             <w:r>
               <w:rPr>
-                <w:bCs/>
-                <w:b/>
+                <w:iCs/>
+                <w:i/>
               </w:rPr>
-              <w:t xml:space="preserve">A definir</w:t>
+              <w:t xml:space="preserve">Si se solicita rebaja</w:t>
+            </w:r>
+          </w:p>
+        </w:tc>
+        <w:tc>
+          <w:tcPr/>
+          <w:p>
+            <w:pPr>
+              <w:pStyle w:val="Compact"/>
+              <w:jc w:val="left"/>
+            </w:pPr>
+            <w:r>
+              <w:rPr>
+                <w:iCs/>
+                <w:i/>
+              </w:rPr>
+              <w:t xml:space="preserve">$85.000.000</w:t>
             </w:r>
           </w:p>
         </w:tc>
       </w:tr>
     </w:tbl>
+    <w:p>
+      <w:pPr>
+        <w:pStyle w:val="BodyText"/>
+      </w:pPr>
+      <w:r>
+        <w:rPr>
+          <w:bCs/>
+          <w:b/>
+        </w:rPr>
+        <w:t xml:space="preserve">Nota:</w:t>
+      </w:r>
+      <w:r>
+        <w:t xml:space="preserve"> </w:t>
+      </w:r>
+      <w:r>
+        <w:t xml:space="preserve">Los impuestos (IVA, estampillas y demás tributos territoriales) se facturarán por separado según la normativa aplicable a Metro Sabanas S.A.S. en Sincelejo, Sucre.</w:t>
+      </w:r>
+    </w:p>
     <w:p>
       <w:pPr>
         <w:pStyle w:val="BodyText"/>
@@ -3222,19 +3344,19 @@
               <w:jc w:val="left"/>
             </w:pPr>
             <w:r>
-              <w:t xml:space="preserve">40%</w:t>
-            </w:r>
-          </w:p>
-        </w:tc>
-        <w:tc>
-          <w:tcPr/>
-          <w:p>
-            <w:pPr>
-              <w:pStyle w:val="Compact"/>
-              <w:jc w:val="left"/>
-            </w:pPr>
-            <w:r>
-              <w:t xml:space="preserve">A definir</w:t>
+              <w:t xml:space="preserve">35%</w:t>
+            </w:r>
+          </w:p>
+        </w:tc>
+        <w:tc>
+          <w:tcPr/>
+          <w:p>
+            <w:pPr>
+              <w:pStyle w:val="Compact"/>
+              <w:jc w:val="left"/>
+            </w:pPr>
+            <w:r>
+              <w:t xml:space="preserve">$31.500.000</w:t>
             </w:r>
           </w:p>
         </w:tc>
@@ -3272,19 +3394,19 @@
               <w:jc w:val="left"/>
             </w:pPr>
             <w:r>
-              <w:t xml:space="preserve">30%</w:t>
-            </w:r>
-          </w:p>
-        </w:tc>
-        <w:tc>
-          <w:tcPr/>
-          <w:p>
-            <w:pPr>
-              <w:pStyle w:val="Compact"/>
-              <w:jc w:val="left"/>
-            </w:pPr>
-            <w:r>
-              <w:t xml:space="preserve">A definir</w:t>
+              <w:t xml:space="preserve">25%</w:t>
+            </w:r>
+          </w:p>
+        </w:tc>
+        <w:tc>
+          <w:tcPr/>
+          <w:p>
+            <w:pPr>
+              <w:pStyle w:val="Compact"/>
+              <w:jc w:val="left"/>
+            </w:pPr>
+            <w:r>
+              <w:t xml:space="preserve">$22.500.000</w:t>
             </w:r>
           </w:p>
         </w:tc>
@@ -3322,19 +3444,19 @@
               <w:jc w:val="left"/>
             </w:pPr>
             <w:r>
-              <w:t xml:space="preserve">30%</w:t>
-            </w:r>
-          </w:p>
-        </w:tc>
-        <w:tc>
-          <w:tcPr/>
-          <w:p>
-            <w:pPr>
-              <w:pStyle w:val="Compact"/>
-              <w:jc w:val="left"/>
-            </w:pPr>
-            <w:r>
-              <w:t xml:space="preserve">A definir</w:t>
+              <w:t xml:space="preserve">25%</w:t>
+            </w:r>
+          </w:p>
+        </w:tc>
+        <w:tc>
+          <w:tcPr/>
+          <w:p>
+            <w:pPr>
+              <w:pStyle w:val="Compact"/>
+              <w:jc w:val="left"/>
+            </w:pPr>
+            <w:r>
+              <w:t xml:space="preserve">$22.500.000</w:t>
             </w:r>
           </w:p>
         </w:tc>
@@ -3347,6 +3469,56 @@
             </w:pPr>
             <w:r>
               <w:t xml:space="preserve">Contra entrega y aprobación</w:t>
+            </w:r>
+          </w:p>
+        </w:tc>
+      </w:tr>
+      <w:tr>
+        <w:tc>
+          <w:tcPr/>
+          <w:p>
+            <w:pPr>
+              <w:pStyle w:val="Compact"/>
+              <w:jc w:val="left"/>
+            </w:pPr>
+            <w:r>
+              <w:t xml:space="preserve">Producto 4: Acompañamiento a Procesos de Selección</w:t>
+            </w:r>
+          </w:p>
+        </w:tc>
+        <w:tc>
+          <w:tcPr/>
+          <w:p>
+            <w:pPr>
+              <w:pStyle w:val="Compact"/>
+              <w:jc w:val="left"/>
+            </w:pPr>
+            <w:r>
+              <w:t xml:space="preserve">15%</w:t>
+            </w:r>
+          </w:p>
+        </w:tc>
+        <w:tc>
+          <w:tcPr/>
+          <w:p>
+            <w:pPr>
+              <w:pStyle w:val="Compact"/>
+              <w:jc w:val="left"/>
+            </w:pPr>
+            <w:r>
+              <w:t xml:space="preserve">$13.500.000</w:t>
+            </w:r>
+          </w:p>
+        </w:tc>
+        <w:tc>
+          <w:tcPr/>
+          <w:p>
+            <w:pPr>
+              <w:pStyle w:val="Compact"/>
+              <w:jc w:val="left"/>
+            </w:pPr>
+            <w:r>
+              <w:t xml:space="preserve">Contra entrega del informe final y certificación</w:t>
             </w:r>
           </w:p>
         </w:tc>
@@ -3396,7 +3568,7 @@
                 <w:bCs/>
                 <w:b/>
               </w:rPr>
-              <w:t xml:space="preserve">A definir</w:t>
+              <w:t xml:space="preserve">$90.000.000</w:t>
             </w:r>
           </w:p>
         </w:tc>
@@ -3410,6 +3582,18 @@
         </w:tc>
       </w:tr>
     </w:tbl>
+    <w:p>
+      <w:pPr>
+        <w:pStyle w:val="BodyText"/>
+      </w:pPr>
+      <w:r>
+        <w:rPr>
+          <w:iCs/>
+          <w:i/>
+        </w:rPr>
+        <w:t xml:space="preserve">Nota: Precios de referencia. Base estructuración $70M + acompañamiento adicional $20M. Precio negociable: $85.000.000 si se solicita descuento.</w:t>
+      </w:r>
+    </w:p>
     <w:p>
       <w:r>
         <w:pict>
@@ -3417,8 +3601,8 @@
         </w:pict>
       </w:r>
     </w:p>
-    <w:bookmarkEnd w:id="43"/>
-    <w:bookmarkStart w:id="44" w:name="exclusiones-del-alcance"/>
+    <w:bookmarkEnd w:id="44"/>
+    <w:bookmarkStart w:id="45" w:name="exclusiones-del-alcance"/>
     <w:p>
       <w:pPr>
         <w:pStyle w:val="Heading1"/>
@@ -3514,8 +3698,8 @@
         </w:pict>
       </w:r>
     </w:p>
-    <w:bookmarkEnd w:id="44"/>
-    <w:bookmarkStart w:id="45" w:name="declaraciones"/>
+    <w:bookmarkEnd w:id="45"/>
+    <w:bookmarkStart w:id="46" w:name="declaraciones"/>
     <w:p>
       <w:pPr>
         <w:pStyle w:val="Heading1"/>
@@ -3539,8 +3723,8 @@
         </w:pict>
       </w:r>
     </w:p>
-    <w:bookmarkEnd w:id="45"/>
-    <w:bookmarkStart w:id="46" w:name="representante-legal"/>
+    <w:bookmarkEnd w:id="46"/>
+    <w:bookmarkStart w:id="47" w:name="representante-legal"/>
     <w:p>
       <w:pPr>
         <w:pStyle w:val="Heading1"/>
@@ -3665,7 +3849,7 @@
         <w:t xml:space="preserve">”</w:t>
       </w:r>
     </w:p>
-    <w:bookmarkEnd w:id="46"/>
+    <w:bookmarkEnd w:id="47"/>
     <w:sectPr/>
   </w:body>
 </w:document>

</xml_diff>